<commit_message>
Final edits to chapter 3.
</commit_message>
<xml_diff>
--- a/3 - The Valley that Laughs.docx
+++ b/3 - The Valley that Laughs.docx
@@ -5,7 +5,7 @@
   <w:body>
     <w:p>
       <w:pPr>
-        <w:pStyle w:val="Heading1"/>
+        <w:pStyle w:val="Heading2"/>
       </w:pPr>
       <w:bookmarkStart w:id="0" w:name="_Toc231080403"/>
       <w:bookmarkStart w:id="1" w:name="_Toc231082563"/>
@@ -137,31 +137,7 @@
           <w:i/>
           <w:iCs/>
         </w:rPr>
-        <w:t>I’ve</w:t>
-      </w:r>
-      <w:r>
-        <w:rPr>
-          <w:i/>
-          <w:iCs/>
-        </w:rPr>
-        <w:t xml:space="preserve"> still got it</w:t>
-      </w:r>
-      <w:r>
-        <w:rPr>
-          <w:i/>
-          <w:iCs/>
-        </w:rPr>
-        <w:t xml:space="preserve"> when I</w:t>
-      </w:r>
-      <w:r>
-        <w:rPr>
-          <w:i/>
-          <w:iCs/>
-        </w:rPr>
-        <w:t xml:space="preserve"> can make a tree cry</w:t>
-      </w:r>
-      <w:r>
-        <w:t>.</w:t>
+        <w:t>I’ve still got it when I can make a tree cry.</w:t>
       </w:r>
     </w:p>
     <w:p>
@@ -207,26 +183,27 @@
         <w:t xml:space="preserve">Jack tries not to drop the watch and to contain the laughter at the man as he was blinded, stumbled, fell, and panicked against the tree. He’s sure he made the correct decision for a </w:t>
       </w:r>
       <w:r>
+        <w:t>‘</w:t>
+      </w:r>
+      <w:r>
+        <w:t>change</w:t>
+      </w:r>
+      <w:r>
+        <w:t>’</w:t>
+      </w:r>
+      <w:r>
+        <w:t xml:space="preserve"> for Lea. He gives his feathers a settling ripple and pretends to not notice the man, hoping to lure him to jump. The man sighs and slaps his legs, making a sharp crack echo through the area. The man begins to speak.</w:t>
+      </w:r>
+    </w:p>
+    <w:p>
+      <w:r>
+        <w:t xml:space="preserve">“Look, </w:t>
+      </w:r>
+      <w:r>
         <w:rPr>
-          <w:i/>
-          <w:iCs/>
+          <w:u w:val="single"/>
         </w:rPr>
-        <w:t>change</w:t>
-      </w:r>
-      <w:r>
-        <w:t xml:space="preserve"> for Lea. He gives his feathers a settling ripple and pretends to not notice the man, hoping to lure him to jump. The man sighs and slaps his legs, making a sharp crack echo through the area. The man begins to speak.</w:t>
-      </w:r>
-    </w:p>
-    <w:p>
-      <w:r>
-        <w:t xml:space="preserve">“Look, Mr. </w:t>
-      </w:r>
-      <w:r>
-        <w:rPr>
-          <w:i/>
-          <w:iCs/>
-        </w:rPr>
-        <w:t>Poe</w:t>
+        <w:t>Mr. Poe</w:t>
       </w:r>
       <w:r>
         <w:t>, normally I wouldn’t give two shits about what you took. But could we make a bargain about the watch? It’s one of the last things of my father’s I own, and Lynn said I shouldn’t wear it, but I feel like he’s still with me when I do. How about the shiny bead bracelet my daughter made me? It’s gold, silver, and copper, with black leather bands and red beads that look like rubies. Please?”</w:t>
@@ -259,10 +236,10 @@
           <w:i/>
           <w:iCs/>
         </w:rPr>
-        <w:t>Maverick and Iceman should have been so talented</w:t>
-      </w:r>
-      <w:r>
-        <w:t>. Frank suddenly breaks through to wide open sky, with high wisps of clouds highlighting the two birds still in battle. He stops cold and looks around. A campfire with low coals, a lake, saddle bags, a stump with a basket of cherries, and a willow tree. He’s found the valley.</w:t>
+        <w:t>Maverick and Iceman should have been so talented.</w:t>
+      </w:r>
+      <w:r>
+        <w:t xml:space="preserve"> Frank suddenly breaks through to wide open sky, with high wisps of clouds highlighting the two birds still in battle. He stops cold and looks around. A campfire with low coals, a lake, saddle bags, a stump with a basket of cherries, and a willow tree. He’s found the valley.</w:t>
       </w:r>
     </w:p>
     <w:p>
@@ -331,10 +308,10 @@
           <w:i/>
           <w:iCs/>
         </w:rPr>
-        <w:t>That was one mad cat</w:t>
-      </w:r>
-      <w:r>
-        <w:t>, he affirms.</w:t>
+        <w:t>That was one mad cat,</w:t>
+      </w:r>
+      <w:r>
+        <w:t xml:space="preserve"> he affirms.</w:t>
       </w:r>
     </w:p>
     <w:p>
@@ -346,15 +323,23 @@
           <w:i/>
           <w:iCs/>
         </w:rPr>
-        <w:t>What’s good for one foot</w:t>
-      </w:r>
-      <w:r>
-        <w:t>… before performing the same maneuver on the other leg. He immerses his hand in next to his foot, swishing it around to get a better look at it. He doesn’t see any blood, but he finds the light is not penetrating the lake at this shallow of a depth. He notices the valley seems to be darkening with shadows lengthening. He goes to check the time and remembers the watch is gone. Before he can look away, a hand grabs his arm just below the wrist. He’s aware of another hand compressing his fingers as the gold watch slides in place onto his wrist.</w:t>
-      </w:r>
-    </w:p>
-    <w:p>
-      <w:r>
-        <w:t>He looks up and sees rosy-pink lips curled into a smile that reaches her ice blue eyes. She lowers her eyes shyly and kneels down, taking his other hand in hers. He watches amazed as she examines his hand with a soft, velvety touch. Satisfied, she declares, “You will live and we won’t have to amputate.” She rises and he’s still gobsmacked as he realizes how tall and statuesque she is.</w:t>
+        <w:t>What’s good for one foot…</w:t>
+      </w:r>
+      <w:r>
+        <w:t xml:space="preserve"> before performing the same maneuver on the other leg. He immerses his hand in next to his foot, swishing it around to get a better look at it. He doesn’t see any blood, but he finds the light is not penetrating the lake at this shallow of a depth. He notices the valley seems to be darkening with shadows lengthening. He goes to check the time and remembers the watch is gone. Before he can look away, a hand grabs his arm just below the wrist. He’s aware of another hand compressing his fingers as the gold watch slides in place onto his wrist.</w:t>
+      </w:r>
+    </w:p>
+    <w:p>
+      <w:r>
+        <w:t xml:space="preserve">He looks up and sees rosy-pink </w:t>
+      </w:r>
+      <w:proofErr w:type="spellStart"/>
+      <w:r>
+        <w:t>lips</w:t>
+      </w:r>
+      <w:proofErr w:type="spellEnd"/>
+      <w:r>
+        <w:t xml:space="preserve"> curled into a smile that reaches her ice blue eyes. She lowers her eyes shyly and kneels down, taking his other hand in hers. He watches amazed as she examines his hand with a soft, velvety touch. Satisfied, she declares, “You will live and we won’t have to amputate.” She rises and he’s still gobsmacked as he realizes how tall and statuesque she is.</w:t>
       </w:r>
     </w:p>
     <w:p>
@@ -390,7 +375,15 @@
     </w:p>
     <w:p>
       <w:r>
-        <w:t>Frank sees through her teasing and decides to play the game. “The bird was a ‘he.’ I coulda swore it was a she. Shaking its tail feathers at me and flirting like that. Had to definitely be a she because I’m so irresistible.”</w:t>
+        <w:t xml:space="preserve">Frank sees through her teasing and decides to play the game. “The bird was a ‘he.’ I </w:t>
+      </w:r>
+      <w:proofErr w:type="spellStart"/>
+      <w:r>
+        <w:t>coulda</w:t>
+      </w:r>
+      <w:proofErr w:type="spellEnd"/>
+      <w:r>
+        <w:t xml:space="preserve"> swore it was a she. Shaking its tail feathers at me and flirting like that. Had to definitely be a she because I’m so irresistible.”</w:t>
       </w:r>
     </w:p>
     <w:p>
@@ -432,113 +425,89 @@
       <w:r>
         <w:lastRenderedPageBreak/>
         <w:t xml:space="preserve">“Frank, this is my brother Jack. He’s just visiting. Jack, this is Frank. </w:t>
+      </w:r>
+      <w:r>
+        <w:rPr>
+          <w:u w:val="single"/>
+        </w:rPr>
+        <w:t>My neighbor.</w:t>
+      </w:r>
+      <w:r>
+        <w:t>” Lea crosses her arms and nods at Jack to offer Frank his hand. Jack extends his hand to Frank, who takes it. Both men start to grip hard to assert dominance over the other before the pain causes Frank to release and jerk back quickly.</w:t>
+      </w:r>
+    </w:p>
+    <w:p>
+      <w:r>
+        <w:t>With a smug smile and a voice laced with the laughter underneath, Jack replies, “Sorry about that man. Nice to meet you. You might want to have that hand looked at when you return to town.” His eyes shift to his sister behind Jack. “Shame on you Sissy. Teasing him like that! You are such a pixie!”</w:t>
+      </w:r>
+    </w:p>
+    <w:p>
+      <w:r>
+        <w:t>“Like you are one to talk. Pot calling kettle.” Lea sighs and shifts her gaze to Frank. “Jack saw you taking pictures at the campsite earlier. So, no, he’s not the raven. And relax. This is not some witch’s cottage to trap little children or adults and eat their toes. Those were trout fry, and they nibble on everything. Some people pay big bucks for that kind of pedicure. Considering the professional manicure on your hands, I’m surprised you haven’t tried it before.”</w:t>
+      </w:r>
+    </w:p>
+    <w:p>
+      <w:r>
+        <w:t>Frank shifts nervously and blushes. “I guess I did overreact just a little bit. It’s been a crazy day with the animals all around.” He studies Lea for a moment, replaying the conversation in his head, and is impressed she actually met him at his level of wit. Frank feels a sense of admiration when it dawns on him she was able to escalate and outperform him. He feels his spark returning and a new challenge.</w:t>
+      </w:r>
+    </w:p>
+    <w:p>
+      <w:r>
+        <w:t>Jack disrupts Frank’s thoughts when he places a hand on his shoulder. “You okay, dude?”</w:t>
+      </w:r>
+    </w:p>
+    <w:p>
+      <w:r>
+        <w:t>“Yeah, sorry, just lost in thought for a minute. Did I miss something?”</w:t>
+      </w:r>
+    </w:p>
+    <w:p>
+      <w:r>
+        <w:t>The smirk on Lea’s face has returned, and she shakes her head, causing a cascading wave of liquid metals. “I was saying if we are going to get you back to the campsite and to your car before dark, we had best be going. Do you think you can walk?”</w:t>
+      </w:r>
+    </w:p>
+    <w:p>
+      <w:r>
+        <w:t xml:space="preserve">“Yeah. Yeah. </w:t>
+      </w:r>
+      <w:proofErr w:type="gramStart"/>
+      <w:r>
+        <w:t>No</w:t>
+      </w:r>
+      <w:proofErr w:type="gramEnd"/>
+      <w:r>
+        <w:t xml:space="preserve"> I’m good. Lead the way please.”</w:t>
+      </w:r>
+    </w:p>
+    <w:p>
+      <w:r>
+        <w:t>“You two kids go on. I’m not dressed to wander the woods tonight. I’ll just stay here and prepare dinner. Nice to meet you Frank.” A pure devilish grin spreads over his face. “Sis, you might want to tether him so you can lead him proper through the forest since you don’t have tail feathers for him to follow.”</w:t>
+      </w:r>
+    </w:p>
+    <w:p>
+      <w:r>
+        <w:t>Frank blushes again and is flustered. “Is he a big brother or a little brother? Nice to meet you too, I think, Jack.</w:t>
+      </w:r>
+      <w:r>
+        <w:t>”</w:t>
+      </w:r>
+    </w:p>
+    <w:p>
+      <w:r>
+        <w:lastRenderedPageBreak/>
+        <w:t>Lea shoots her brother an evil glare before shifting her gaze back to Frank and, with an edge of irritation, proclaims, “A big bother!” She walks over and gives him a hug. She whispers in his ear, “I think the cougar wants roasted crow for dinner.” All color beneath the tan drains from Jack’s face as she kisses his cheek. She pulls away, but before breaking the hug, lands a slap to the back of the head. He laughs and waves goodbye to her and Frank before rubbing the back of his head.</w:t>
+      </w:r>
+    </w:p>
+    <w:p>
+      <w:r>
+        <w:t xml:space="preserve">Jack watches them leave as Lea’s ethereal glow helps light the path in the already near pitch-black forest. The trees part in an elegant curtsey as she passes. If Frank notices, he doesn’t comment or look in awe around him. He is focused on the conversation as his sister teases and banters with him on the walk to the campsite and the path to the parking lot. Jack follows at a safe distance, watching closely for any signs his sister might be withdrawing again. He is pleased with the rhythm she and Frank seem to have. Arriving at his car in the parking area lit by a lonely streetlight with a halo of insects, Jack leans in to hear the conversation. He thinks to himself, </w:t>
       </w:r>
       <w:r>
         <w:rPr>
           <w:i/>
           <w:iCs/>
         </w:rPr>
-        <w:t>M</w:t>
-      </w:r>
-      <w:r>
-        <w:rPr>
-          <w:i/>
-          <w:iCs/>
-        </w:rPr>
-        <w:t>y neighbor</w:t>
-      </w:r>
-      <w:r>
-        <w:t>.” Lea crosses her arms and nods at Jack to offer Frank his hand. Jack extends his hand to Frank, who takes it. Both men start to grip hard to assert dominance over the other before the pain causes Frank to release and jerk back quickly.</w:t>
-      </w:r>
-    </w:p>
-    <w:p>
-      <w:r>
-        <w:t>With a smug smile and a voice laced with the laughter underneath, Jack replies, “Sorry about that man. Nice to meet you. You might want to have that hand looked at when you return to town.” His eyes shift to his sister behind Jack. “Shame on you Sissy. Teasing him like that! You are such a pixie!”</w:t>
-      </w:r>
-    </w:p>
-    <w:p>
-      <w:r>
-        <w:t>“Like you are one to talk. Pot calling kettle.” Lea sighs and shifts her gaze to Frank. “Jack saw you taking pictures at the campsite earlier. So, no, he’s not the raven. And relax. This is not some witch’s cottage to trap little children or adults and eat their toes. Those were trout fry, and they nibble on everything. Some people pay big bucks for that kind of pedicure. Considering the professional manicure on your hands, I’m surprised you haven’t tried it before.”</w:t>
-      </w:r>
-    </w:p>
-    <w:p>
-      <w:r>
-        <w:t>Frank shifts nervously and blushes. “I guess I did overreact just a little bit. It’s been a crazy day with the animals all around.” He studies Lea for a moment, replaying the conversation in his head, and is impressed she actually met him at his level of wit. Frank feels a sense of admiration when it dawns on him she was able to escalate and outperform him. He feels his spark returning and a new challenge.</w:t>
-      </w:r>
-    </w:p>
-    <w:p>
-      <w:r>
-        <w:t>Jack disrupts Frank’s thoughts when he places a hand on his shoulder. “You okay, dude?”</w:t>
-      </w:r>
-    </w:p>
-    <w:p>
-      <w:r>
-        <w:t>“Yeah, sorry, just lost in thought for a minute. Did I miss something?”</w:t>
-      </w:r>
-    </w:p>
-    <w:p>
-      <w:r>
-        <w:t>The smirk on Lea’s face has returned, and she shakes her head, causing a cascading wave of liquid metals. “I was saying if we are going to get you back to the campsite and to your car before dark, we had best be going. Do you think you can walk?”</w:t>
-      </w:r>
-    </w:p>
-    <w:p>
-      <w:r>
-        <w:t>“Yeah. Yeah. No I’m good. Lead the way please.”</w:t>
-      </w:r>
-    </w:p>
-    <w:p>
-      <w:r>
-        <w:t>“You two kids go on. I’m not dressed to wander the woods tonight. I’ll just stay here and prepare dinner. Nice to meet you Frank.” A pure devilish grin spreads over his face. “Sis, you might want to tether him so you can lead him proper through the forest since you don’t have tail feathers for him to follow.”</w:t>
-      </w:r>
-    </w:p>
-    <w:p>
-      <w:r>
-        <w:t>Frank blushes again and is flustered. “Is he a big brother or a little brother? Nice to meet you too, I think, Jack.</w:t>
-      </w:r>
-      <w:r>
-        <w:t>”</w:t>
-      </w:r>
-    </w:p>
-    <w:p>
-      <w:r>
-        <w:lastRenderedPageBreak/>
-        <w:t>Lea shoots her brother an evil glare before shifting her gaze back to Frank and, with an edge of irritation, proclaims, “A big bother!” She walks over and gives him a hug. She whispers in his ear, “I think the cougar wants roasted crow for dinner.” All color beneath the tan drains from Jack’s face as she kisses his cheek. She pulls away, but before breaking the hug, lands a slap to the back of the head. He laughs and waves goodbye to her and Frank before rubbing the back of his head.</w:t>
-      </w:r>
-    </w:p>
-    <w:p>
-      <w:r>
-        <w:t xml:space="preserve">Jack watches them leave as Lea’s ethereal glow helps light the path in the already near pitch-black forest. The trees part in an elegant curtsey as she passes. If Frank notices, he doesn’t comment or look in awe around him. He is focused on the conversation as his sister teases and banters with him on the walk to the campsite and the path to the parking lot. Jack follows at a safe distance, watching closely for any signs his sister might be withdrawing again. He is pleased with the rhythm she and Frank seem to have. Arriving at his car in the parking area lit by a lonely streetlight with a halo of insects, Jack leans in to hear the conversation. He thinks to himself, </w:t>
-      </w:r>
-      <w:r>
-        <w:rPr>
-          <w:i/>
-          <w:iCs/>
-        </w:rPr>
-        <w:t>W</w:t>
-      </w:r>
-      <w:r>
-        <w:rPr>
-          <w:i/>
-          <w:iCs/>
-        </w:rPr>
-        <w:t>ell</w:t>
-      </w:r>
-      <w:r>
-        <w:rPr>
-          <w:i/>
-          <w:iCs/>
-        </w:rPr>
-        <w:t>,</w:t>
-      </w:r>
-      <w:r>
-        <w:rPr>
-          <w:i/>
-          <w:iCs/>
-        </w:rPr>
-        <w:t xml:space="preserve"> it’s a start</w:t>
-      </w:r>
-      <w:r>
-        <w:t>.</w:t>
+        <w:t>Well, it’s a start.</w:t>
       </w:r>
     </w:p>
     <w:p>
@@ -573,7 +542,15 @@
     </w:p>
     <w:p>
       <w:r>
-        <w:t>Frank’s whole body flushes. “I… ummm. Well…”</w:t>
+        <w:t xml:space="preserve">Frank’s whole body flushes. “I… </w:t>
+      </w:r>
+      <w:proofErr w:type="spellStart"/>
+      <w:r>
+        <w:t>ummm</w:t>
+      </w:r>
+      <w:proofErr w:type="spellEnd"/>
+      <w:r>
+        <w:t>. Well…”</w:t>
       </w:r>
     </w:p>
     <w:p>
@@ -996,7 +973,7 @@
   <w:style w:type="paragraph" w:default="1" w:styleId="Normal">
     <w:name w:val="Normal"/>
     <w:qFormat/>
-    <w:rsid w:val="00ED4380"/>
+    <w:rsid w:val="00036660"/>
     <w:pPr>
       <w:keepNext/>
       <w:keepLines/>
@@ -1030,19 +1007,19 @@
     <w:basedOn w:val="Normal"/>
     <w:next w:val="Normal"/>
     <w:link w:val="Heading2Char"/>
+    <w:autoRedefine/>
     <w:uiPriority w:val="9"/>
-    <w:semiHidden/>
     <w:unhideWhenUsed/>
     <w:qFormat/>
-    <w:rsid w:val="0051428B"/>
+    <w:rsid w:val="00036660"/>
     <w:pPr>
-      <w:spacing w:before="160" w:after="80"/>
+      <w:spacing w:after="240"/>
+      <w:jc w:val="center"/>
       <w:outlineLvl w:val="1"/>
     </w:pPr>
     <w:rPr>
       <w:rFonts w:eastAsiaTheme="majorEastAsia" w:cstheme="majorBidi"/>
-      <w:color w:val="365F91" w:themeColor="accent1" w:themeShade="BF"/>
-      <w:sz w:val="32"/>
+      <w:sz w:val="52"/>
       <w:szCs w:val="32"/>
     </w:rPr>
   </w:style>
@@ -1219,12 +1196,10 @@
     <w:basedOn w:val="DefaultParagraphFont"/>
     <w:link w:val="Heading2"/>
     <w:uiPriority w:val="9"/>
-    <w:semiHidden/>
-    <w:rsid w:val="0051428B"/>
+    <w:rsid w:val="00036660"/>
     <w:rPr>
       <w:rFonts w:ascii="Times New Roman" w:eastAsiaTheme="majorEastAsia" w:hAnsi="Times New Roman" w:cstheme="majorBidi"/>
-      <w:color w:val="365F91" w:themeColor="accent1" w:themeShade="BF"/>
-      <w:sz w:val="32"/>
+      <w:sz w:val="52"/>
       <w:szCs w:val="32"/>
     </w:rPr>
   </w:style>

</xml_diff>